<commit_message>
P/C is client name; add shipping company selector for Mise a Quai
</commit_message>
<xml_diff>
--- a/frontend/api/templates/MISE A QUAI L.docx
+++ b/frontend/api/templates/MISE A QUAI L.docx
@@ -262,11 +262,16 @@
                 <w:b/>
                 <w:bCs/>
               </w:rPr>
-              <w:t>{{ container_marque }}</w:t>
+              <w:t>{{ container</w:t>
             </w:r>
-            <w:proofErr w:type="spellStart"/>
             <w:proofErr w:type="gramEnd"/>
-            <w:proofErr w:type="spellEnd"/>
+            <w:r>
+              <w:rPr>
+                <w:b/>
+                <w:bCs/>
+              </w:rPr>
+              <w:t>_marque }}</w:t>
+            </w:r>
           </w:p>
         </w:tc>
         <w:tc>
@@ -352,7 +357,7 @@
     </w:p>
     <w:tbl>
       <w:tblPr>
-        <w:tblW w:type="dxa" w:w="9498"/>
+        <w:tblW w:w="9498" w:type="dxa"/>
         <w:tblBorders>
           <w:top w:val="nil"/>
           <w:left w:val="nil"/>
@@ -362,7 +367,7 @@
           <w:insideV w:val="nil"/>
         </w:tblBorders>
         <w:tblLayout w:type="fixed"/>
-        <w:tblLook w:firstColumn="1" w:firstRow="1" w:lastColumn="0" w:lastRow="0" w:noHBand="0" w:noVBand="1" w:val="04A0"/>
+        <w:tblLook w:val="04A0" w:firstRow="1" w:lastRow="0" w:firstColumn="1" w:lastColumn="0" w:noHBand="0" w:noVBand="1"/>
       </w:tblPr>
       <w:tblGrid>
         <w:gridCol w:w="4650"/>
@@ -371,7 +376,7 @@
       <w:tr>
         <w:tc>
           <w:tcPr>
-            <w:tcW w:type="dxa" w:w="4650"/>
+            <w:tcW w:w="4650" w:type="dxa"/>
           </w:tcPr>
           <w:p>
             <w:r>
@@ -379,20 +384,13 @@
                 <w:b/>
                 <w:bCs/>
               </w:rPr>
-              <w:t xml:space="preserve">TRANSIT : </w:t>
-            </w:r>
-            <w:r>
-              <w:rPr>
-                <w:b/>
-                <w:bCs/>
-              </w:rPr>
-              <w:t>{{ transit_name }}</w:t>
+              <w:t>TRANSIT : {{ transit_name }}</w:t>
             </w:r>
           </w:p>
         </w:tc>
         <w:tc>
           <w:tcPr>
-            <w:tcW w:type="dxa" w:w="4848"/>
+            <w:tcW w:w="4848" w:type="dxa"/>
           </w:tcPr>
           <w:p>
             <w:r>
@@ -400,14 +398,7 @@
                 <w:b/>
                 <w:bCs/>
               </w:rPr>
-              <w:t xml:space="preserve">P/C : </w:t>
-            </w:r>
-            <w:r>
-              <w:rPr>
-                <w:b/>
-                <w:bCs/>
-              </w:rPr>
-              <w:t>{{ p_c }}</w:t>
+              <w:t>P/C : {{ client_name }}</w:t>
             </w:r>
           </w:p>
         </w:tc>
@@ -1142,7 +1133,17 @@
           <w:sz w:val="28"/>
           <w:szCs w:val="28"/>
         </w:rPr>
-        <w:t xml:space="preserve">         </w:t>
+        <w:t xml:space="preserve">       </w:t>
+      </w:r>
+      <w:r>
+        <w:rPr>
+          <w:b/>
+          <w:bCs/>
+          <w:sz w:val="28"/>
+          <w:szCs w:val="28"/>
+          <w:u w:val="single"/>
+        </w:rPr>
+        <w:t>E.P.AN</w:t>
       </w:r>
       <w:r>
         <w:rPr>
@@ -1153,37 +1154,55 @@
       </w:r>
       <w:r>
         <w:rPr>
-          <w:b/>
-          <w:bCs/>
-          <w:sz w:val="28"/>
-          <w:szCs w:val="28"/>
-          <w:u w:val="single"/>
-        </w:rPr>
-        <w:t>E.P.AN</w:t>
-      </w:r>
-      <w:r>
-        <w:rPr>
-          <w:sz w:val="28"/>
-          <w:szCs w:val="28"/>
-        </w:rPr>
-        <w:t xml:space="preserve">  </w:t>
-      </w:r>
-      <w:r>
-        <w:rPr>
-          <w:sz w:val="28"/>
-          <w:szCs w:val="28"/>
-        </w:rPr>
-        <w:t xml:space="preserve">                      </w:t>
-      </w:r>
-      <w:r>
-        <w:rPr>
-          <w:b/>
-          <w:bCs/>
-          <w:sz w:val="28"/>
-          <w:szCs w:val="28"/>
-          <w:u w:val="single"/>
-        </w:rPr>
-        <w:t>AKKON</w:t>
+          <w:sz w:val="28"/>
+          <w:szCs w:val="28"/>
+        </w:rPr>
+        <w:t xml:space="preserve">                 </w:t>
+      </w:r>
+      <w:proofErr w:type="gramStart"/>
+      <w:r>
+        <w:rPr>
+          <w:sz w:val="28"/>
+          <w:szCs w:val="28"/>
+        </w:rPr>
+        <w:t xml:space="preserve"> </w:t>
+      </w:r>
+      <w:r>
+        <w:rPr>
+          <w:sz w:val="28"/>
+          <w:szCs w:val="28"/>
+        </w:rPr>
+        <w:t xml:space="preserve">  {</w:t>
+      </w:r>
+      <w:proofErr w:type="gramEnd"/>
+      <w:r>
+        <w:rPr>
+          <w:b/>
+          <w:bCs/>
+          <w:sz w:val="28"/>
+          <w:szCs w:val="28"/>
+        </w:rPr>
+        <w:t>{</w:t>
+      </w:r>
+      <w:proofErr w:type="spellStart"/>
+      <w:r>
+        <w:rPr>
+          <w:b/>
+          <w:bCs/>
+          <w:sz w:val="28"/>
+          <w:szCs w:val="28"/>
+        </w:rPr>
+        <w:t>company_name</w:t>
+      </w:r>
+      <w:proofErr w:type="spellEnd"/>
+      <w:r>
+        <w:rPr>
+          <w:b/>
+          <w:bCs/>
+          <w:sz w:val="28"/>
+          <w:szCs w:val="28"/>
+        </w:rPr>
+        <w:t>}}</w:t>
       </w:r>
     </w:p>
     <w:sectPr>

</xml_diff>